<commit_message>
Document pre-gate Model hash API boundary with offline IL evidence
</commit_message>
<xml_diff>
--- a/docs/releases/v0.3.3.1-qa-forensics-pr18/GlassHeroesBusiness_v0.3.3.1_qa-forensics-pr18_Developer_Guide.docx
+++ b/docs/releases/v0.3.3.1-qa-forensics-pr18/GlassHeroesBusiness_v0.3.3.1_qa-forensics-pr18_Developer_Guide.docx
@@ -74,6 +74,11 @@
     <w:p>
       <w:r>
         <w:t>4. Review startup and abort if evidence points there. R2 constructor loads managed settings/save data, normalizes records and subscribes events. Audit found no explicit world/native creation in that constructor. After its UTC delay it validates the player in OnTick. Abort before activation returns without Save; after activation it cleans owned entities/models and saves, using existing native operations. A fatal overflow may bypass Aborted entirely. No cleanup/accounting change was justified by available evidence.</w:t>
+      </w:r>
+    </w:p>
+    <w:p>
+      <w:r>
+        <w:t>Constructor API boundary: R2 creates seven Model wrappers before activation. An IL-only inspection of the pinned SHVDN2 2.11.6 API DLL (api-hash-boundary.txt, reproducible tool under verification/forensic-audit/api-il) confirms Model(string) calls Game.GenerateHash, which calls SHVDN.NativeMemory.GetHashKey in the core runtime. The integer Model constructor sets Hash. The core helper implementation is outside the API assembly inspected here. Thus the source static check's zero explicit GTA native-invoker calls does NOT establish an entirely managed constructor or rule out API/core initialization interactions. This is an audit limitation and a startup-isolation hypothesis, not an identified overflow or evidence of recursion. No model initialization or other startup behavior was moved speculatively. The IL inspection reads metadata offline and does not load/execute the game API.</w:t>
       </w:r>
     </w:p>
     <w:p>

</xml_diff>